<commit_message>
9.1.3.5: remove fact/opinion task, replace netiquette and blackmailer wording in Kazakh
Co-Authored-By: Claude Opus 5.5 <noreply@anthropic.com>
Claude-Session: https://claude.ai/code/session_0164xp6oPnH8L5Boehw5Rv1U
</commit_message>
<xml_diff>
--- a/9.1.3.5-qauipsizdik/plan-uroka-9.1.3.5-ru.docx
+++ b/9.1.3.5-qauipsizdik/plan-uroka-9.1.3.5-ru.docx
@@ -1108,7 +1108,7 @@
                 <w:sz w:val="22"/>
                 <w:szCs w:val="22"/>
               </w:rPr>
-              <w:t xml:space="preserve">Приветствие. Знакомит с планом урока: работа с текстом → веб-ресурс (теория и 15 заданий) → рефлексия.</w:t>
+              <w:t xml:space="preserve">Приветствие. Знакомит с планом урока: работа с текстом → веб-ресурс (теория и 14 заданий) → рефлексия.</w:t>
             </w:r>
           </w:p>
         </w:tc>
@@ -2075,7 +2075,7 @@
                 <w:sz w:val="22"/>
                 <w:szCs w:val="22"/>
               </w:rPr>
-              <w:t xml:space="preserve">Веб-ресурс: 15 заданий</w:t>
+              <w:t xml:space="preserve">Веб-ресурс: 14 заданий</w:t>
             </w:r>
           </w:p>
           <w:p>

</xml_diff>

<commit_message>
9.1.3.5: INSERT marks for each term in term lists
Co-Authored-By: Claude Opus 5.5 <noreply@anthropic.com>
Claude-Session: https://claude.ai/code/session_0164xp6oPnH8L5Boehw5Rv1U
</commit_message>
<xml_diff>
--- a/9.1.3.5-qauipsizdik/plan-uroka-9.1.3.5-ru.docx
+++ b/9.1.3.5-qauipsizdik/plan-uroka-9.1.3.5-ru.docx
@@ -1972,7 +1972,7 @@
                 <w:sz w:val="22"/>
                 <w:szCs w:val="22"/>
               </w:rPr>
-              <w:t xml:space="preserve">: под каждым абзацем кнопки ✓ «Знаю», + «Новое», − «Думал(а) иначе», ? «Непонятно». Пока все абзацы не отмечены, перейти к работе нельзя. Учитель советует читать не спеша.</w:t>
+              <w:t xml:space="preserve">: под каждым абзацем и рядом с каждым термином в списках кнопки ✓ «Знаю», + «Новое», − «Думал(а) иначе», ? «Непонятно». Пока все абзацы и термины не отмечены, перейти к работе нельзя. Учитель советует читать не спеша.</w:t>
             </w:r>
           </w:p>
         </w:tc>
@@ -1996,7 +1996,7 @@
                 <w:sz w:val="22"/>
                 <w:szCs w:val="22"/>
               </w:rPr>
-              <w:t xml:space="preserve">Читают теорию и отмечают каждый абзац.</w:t>
+              <w:t xml:space="preserve">Читают теорию и отмечают каждый абзац и термин.</w:t>
             </w:r>
           </w:p>
         </w:tc>
@@ -2020,7 +2020,7 @@
                 <w:sz w:val="22"/>
                 <w:szCs w:val="22"/>
               </w:rPr>
-              <w:t xml:space="preserve">На странице результата: число пометок и абзацы с «?», «−» — учитель разъясняет их в конце урока</w:t>
+              <w:t xml:space="preserve">На странице результата: число пометок и абзацы и термины с «?», «−» — учитель разъясняет их в конце урока</w:t>
             </w:r>
           </w:p>
         </w:tc>

</xml_diff>

<commit_message>
9.1.3.5: add 'partly know' INSERT mark
Co-Authored-By: Claude Opus 5.5 <noreply@anthropic.com>
Claude-Session: https://claude.ai/code/session_0164xp6oPnH8L5Boehw5Rv1U
</commit_message>
<xml_diff>
--- a/9.1.3.5-qauipsizdik/plan-uroka-9.1.3.5-ru.docx
+++ b/9.1.3.5-qauipsizdik/plan-uroka-9.1.3.5-ru.docx
@@ -1444,7 +1444,7 @@
                 <w:sz w:val="22"/>
                 <w:szCs w:val="22"/>
               </w:rPr>
-              <w:t xml:space="preserve"> Ученики читают текст самостоятельно и ставят пометки у абзацев: ✓ — уже знал(а), + — новое, − — думал(а) иначе, ? — непонятно / есть вопрос.</w:t>
+              <w:t xml:space="preserve"> Ученики читают текст самостоятельно и ставят пометки у абзацев: ✓ — уже знал(а), ½ — знаю частично, + — новое, − — думал(а) иначе, ? — непонятно / есть вопрос.</w:t>
             </w:r>
           </w:p>
           <w:p>
@@ -1972,7 +1972,7 @@
                 <w:sz w:val="22"/>
                 <w:szCs w:val="22"/>
               </w:rPr>
-              <w:t xml:space="preserve">: под каждым абзацем и рядом с каждым термином в списках кнопки ✓ «Знаю», + «Новое», − «Думал(а) иначе», ? «Непонятно». Пока все абзацы и термины не отмечены, перейти к работе нельзя. Учитель советует читать не спеша.</w:t>
+              <w:t xml:space="preserve">: под каждым абзацем и рядом с каждым термином в списках кнопки ✓ «Знаю», ½ «Знаю частично», + «Новое», − «Думал(а) иначе», ? «Непонятно». Пока все абзацы и термины не отмечены, перейти к работе нельзя. Учитель советует читать не спеша.</w:t>
             </w:r>
           </w:p>
         </w:tc>

</xml_diff>

<commit_message>
9.1.3.5: Kazakh slides, paper version of the 14 tasks (4 variants + key), plan update
Co-Authored-By: Claude Opus 5.5 <noreply@anthropic.com>
Claude-Session: https://claude.ai/code/session_0164xp6oPnH8L5Boehw5Rv1U
</commit_message>
<xml_diff>
--- a/9.1.3.5-qauipsizdik/plan-uroka-9.1.3.5-ru.docx
+++ b/9.1.3.5-qauipsizdik/plan-uroka-9.1.3.5-ru.docx
@@ -1183,6 +1183,19 @@
               <w:t xml:space="preserve">Лист работы с текстом</w:t>
             </w:r>
           </w:p>
+          <w:p>
+            <w:pPr>
+              <w:spacing w:after="80" w:before="0"/>
+            </w:pPr>
+            <w:r>
+              <w:rPr>
+                <w:rFonts w:ascii="Times New Roman" w:cs="Times New Roman" w:eastAsia="Times New Roman" w:hAnsi="Times New Roman"/>
+                <w:sz w:val="22"/>
+                <w:szCs w:val="22"/>
+              </w:rPr>
+              <w:t xml:space="preserve">Презентация: слайд 1</w:t>
+            </w:r>
+          </w:p>
         </w:tc>
       </w:tr>
       <w:tr>
@@ -1369,6 +1382,19 @@
               <w:t xml:space="preserve">Доска; задание 1 на листе</w:t>
             </w:r>
           </w:p>
+          <w:p>
+            <w:pPr>
+              <w:spacing w:after="80" w:before="0"/>
+            </w:pPr>
+            <w:r>
+              <w:rPr>
+                <w:rFonts w:ascii="Times New Roman" w:cs="Times New Roman" w:eastAsia="Times New Roman" w:hAnsi="Times New Roman"/>
+                <w:sz w:val="22"/>
+                <w:szCs w:val="22"/>
+              </w:rPr>
+              <w:t xml:space="preserve">Презентация: слайды 2–4</w:t>
+            </w:r>
+          </w:p>
         </w:tc>
       </w:tr>
       <w:tr>
@@ -1555,6 +1581,19 @@
               <w:t xml:space="preserve">Задания 2–3 на листе</w:t>
             </w:r>
           </w:p>
+          <w:p>
+            <w:pPr>
+              <w:spacing w:after="80" w:before="0"/>
+            </w:pPr>
+            <w:r>
+              <w:rPr>
+                <w:rFonts w:ascii="Times New Roman" w:cs="Times New Roman" w:eastAsia="Times New Roman" w:hAnsi="Times New Roman"/>
+                <w:sz w:val="22"/>
+                <w:szCs w:val="22"/>
+              </w:rPr>
+              <w:t xml:space="preserve">Презентация: слайды 5–6</w:t>
+            </w:r>
+          </w:p>
         </w:tc>
       </w:tr>
       <w:tr>
@@ -2047,6 +2086,19 @@
               <w:t xml:space="preserve">qauipsizdik-9.1.3.5.html</w:t>
             </w:r>
           </w:p>
+          <w:p>
+            <w:pPr>
+              <w:spacing w:after="80" w:before="0"/>
+            </w:pPr>
+            <w:r>
+              <w:rPr>
+                <w:rFonts w:ascii="Times New Roman" w:cs="Times New Roman" w:eastAsia="Times New Roman" w:hAnsi="Times New Roman"/>
+                <w:sz w:val="22"/>
+                <w:szCs w:val="22"/>
+              </w:rPr>
+              <w:t xml:space="preserve">Презентация: слайды 7–16 (разбор тем с пометкой «?»)</w:t>
+            </w:r>
+          </w:p>
         </w:tc>
       </w:tr>
       <w:tr>
@@ -2130,24 +2182,6 @@
                 <w:sz w:val="22"/>
                 <w:szCs w:val="22"/>
               </w:rPr>
-              <w:t xml:space="preserve">, </w:t>
-            </w:r>
-            <w:r>
-              <w:rPr>
-                <w:rFonts w:ascii="Times New Roman" w:cs="Times New Roman" w:eastAsia="Times New Roman" w:hAnsi="Times New Roman"/>
-                <w:b/>
-                <w:bCs/>
-                <w:sz w:val="22"/>
-                <w:szCs w:val="22"/>
-              </w:rPr>
-              <w:t xml:space="preserve">факт или мнение</w:t>
-            </w:r>
-            <w:r>
-              <w:rPr>
-                <w:rFonts w:ascii="Times New Roman" w:cs="Times New Roman" w:eastAsia="Times New Roman" w:hAnsi="Times New Roman"/>
-                <w:sz w:val="22"/>
-                <w:szCs w:val="22"/>
-              </w:rPr>
               <w:t xml:space="preserve">, разбор ситуаций, «Исправь», «Порассуждай».</w:t>
             </w:r>
           </w:p>
@@ -2161,6 +2195,37 @@
                 <w:sz w:val="22"/>
                 <w:szCs w:val="22"/>
               </w:rPr>
+              <w:t xml:space="preserve">Если не хватает компьютеров — </w:t>
+            </w:r>
+            <w:r>
+              <w:rPr>
+                <w:rFonts w:ascii="Times New Roman" w:cs="Times New Roman" w:eastAsia="Times New Roman" w:hAnsi="Times New Roman"/>
+                <w:b/>
+                <w:bCs/>
+                <w:sz w:val="22"/>
+                <w:szCs w:val="22"/>
+              </w:rPr>
+              <w:t xml:space="preserve">бумажный вариант</w:t>
+            </w:r>
+            <w:r>
+              <w:rPr>
+                <w:rFonts w:ascii="Times New Roman" w:cs="Times New Roman" w:eastAsia="Times New Roman" w:hAnsi="Times New Roman"/>
+                <w:sz w:val="22"/>
+                <w:szCs w:val="22"/>
+              </w:rPr>
+              <w:t xml:space="preserve"> (на казахском): те же 14 заданий, 4 варианта (папка qagaz/), учитель проверяет по ключу и 10-балльной шкале.</w:t>
+            </w:r>
+          </w:p>
+          <w:p>
+            <w:pPr>
+              <w:spacing w:after="60" w:before="0"/>
+            </w:pPr>
+            <w:r>
+              <w:rPr>
+                <w:rFonts w:ascii="Times New Roman" w:cs="Times New Roman" w:eastAsia="Times New Roman" w:hAnsi="Times New Roman"/>
+                <w:sz w:val="22"/>
+                <w:szCs w:val="22"/>
+              </w:rPr>
               <w:t xml:space="preserve">Закончившие раньше выполняют дополнительный уровень по кнопке «★ Попробовать ещё» (2 попытки) или берут творческое задание.</w:t>
             </w:r>
           </w:p>
@@ -2209,7 +2274,7 @@
                 <w:sz w:val="22"/>
                 <w:szCs w:val="22"/>
               </w:rPr>
-              <w:t xml:space="preserve">Формативное оценивание: автоматическая проверка; письменные ответы — автоматически/ИИ, при несогласии учитель меняет балл вручную</w:t>
+              <w:t xml:space="preserve">Формативное оценивание: автоматическая проверка; письменные ответы — автоматически/ИИ, при несогласии учитель меняет балл вручную. Оценка по 10-балльной шкале: балл × 10 : максимум</w:t>
             </w:r>
           </w:p>
         </w:tc>
@@ -2234,6 +2299,32 @@
                 <w:szCs w:val="22"/>
               </w:rPr>
               <w:t xml:space="preserve">qauipsizdik-9.1.3.5.html</w:t>
+            </w:r>
+          </w:p>
+          <w:p>
+            <w:pPr>
+              <w:spacing w:after="80" w:before="0"/>
+            </w:pPr>
+            <w:r>
+              <w:rPr>
+                <w:rFonts w:ascii="Times New Roman" w:cs="Times New Roman" w:eastAsia="Times New Roman" w:hAnsi="Times New Roman"/>
+                <w:sz w:val="22"/>
+                <w:szCs w:val="22"/>
+              </w:rPr>
+              <w:t xml:space="preserve">Бумажный вариант: qagaz-tapsyrma-9.1.3.5-1…4-nuska.docx, ключ</w:t>
+            </w:r>
+          </w:p>
+          <w:p>
+            <w:pPr>
+              <w:spacing w:after="80" w:before="0"/>
+            </w:pPr>
+            <w:r>
+              <w:rPr>
+                <w:rFonts w:ascii="Times New Roman" w:cs="Times New Roman" w:eastAsia="Times New Roman" w:hAnsi="Times New Roman"/>
+                <w:sz w:val="22"/>
+                <w:szCs w:val="22"/>
+              </w:rPr>
+              <w:t xml:space="preserve">Презентация: слайд 17</w:t>
             </w:r>
           </w:p>
         </w:tc>
@@ -2397,6 +2488,19 @@
                 <w:szCs w:val="22"/>
               </w:rPr>
               <w:t xml:space="preserve">Задание 6 на листе</w:t>
+            </w:r>
+          </w:p>
+          <w:p>
+            <w:pPr>
+              <w:spacing w:after="80" w:before="0"/>
+            </w:pPr>
+            <w:r>
+              <w:rPr>
+                <w:rFonts w:ascii="Times New Roman" w:cs="Times New Roman" w:eastAsia="Times New Roman" w:hAnsi="Times New Roman"/>
+                <w:sz w:val="22"/>
+                <w:szCs w:val="22"/>
+              </w:rPr>
+              <w:t xml:space="preserve">Презентация: слайд 18</w:t>
             </w:r>
           </w:p>
         </w:tc>

</xml_diff>